<commit_message>
Narrow competitive landscape to three target markets
Co-Authored-By: Claude Fable 5 <noreply@anthropic.com>
Claude-Session: https://claude.ai/code/session_018Bg71BX6us34ZYpqiy24Sa
</commit_message>
<xml_diff>
--- a/STRIVE_Capstone_Competitive_Landscape_Battery_Fleet.docx
+++ b/STRIVE_Capstone_Competitive_Landscape_Battery_Fleet.docx
@@ -14,7 +14,9 @@
         </w:rPr>
         <w:t>STRIVE Capstone — Group 1</w:t>
         <w:br/>
-        <w:t>Competitive Landscape: Utility-Owned Battery Fleet Administration</w:t>
+        <w:t>Competitive Landscape &amp; Target Markets:</w:t>
+        <w:br/>
+        <w:t>Utility-Owned Battery + Solar Fleet Administration</w:t>
       </w:r>
     </w:p>
     <w:p>
@@ -43,7 +45,7 @@
           <w:color w:val="1B2A5E"/>
           <w:sz w:val="32"/>
         </w:rPr>
-        <w:t>1. Headline Finding</w:t>
+        <w:t>1. What We Are Pitching (One Paragraph)</w:t>
       </w:r>
     </w:p>
     <w:p>
@@ -52,7 +54,30 @@
           <w:b/>
           <w:i w:val="0"/>
         </w:rPr>
-        <w:t>As of mid-2026, no company packages "administration of utility-owned residential battery fleets" as a turnkey service. The market splits three ways, and nobody occupies the integrated administrator seat:</w:t>
+        <w:t>The utility finances and owns residential battery + solar systems (in practice: Tesla Powerwalls or equivalent, paired with rooftop solar) deployed as rate-based grid infrastructure. Households host the equipment at zero cost and receive free backup power and lower bills. The utility dispatches the fleet at peak, capturing avoided peak-capacity value of roughly $500–$1,500 per kW. APTIM sells no hardware — APTIM is the program administrator: site selection, household recruitment, hosting agreements, contractor network management, installation QA, and regulatory compliance reporting.</w:t>
+      </w:r>
+    </w:p>
+    <w:p>
+      <w:r>
+        <w:rPr>
+          <w:b w:val="0"/>
+          <w:i/>
+        </w:rPr>
+        <w:t>Division of labor: Tesla makes the batteries. The utility owns them. Software partners (Tesla/EnergyHub) dispatch them. APTIM makes the program work on the ground. Nobody currently sells that last role — every fleet that exists today (Green Mountain Power, Liberty NH) had to improvise it in-house.</w:t>
+      </w:r>
+    </w:p>
+    <w:p>
+      <w:pPr>
+        <w:pStyle w:val="Heading1"/>
+      </w:pPr>
+      <w:r>
+        <w:rPr>
+          <w:rFonts w:ascii="Arial" w:hAnsi="Arial"/>
+          <w:b/>
+          <w:color w:val="1B2A5E"/>
+          <w:sz w:val="32"/>
+        </w:rPr>
+        <w:t>2. Why Nobody Fills This Seat Today (Compressed)</w:t>
       </w:r>
     </w:p>
     <w:tbl>
@@ -77,7 +102,7 @@
               <w:rPr>
                 <w:b/>
               </w:rPr>
-              <w:t>Market Segment</w:t>
+              <w:t>Player Type</w:t>
             </w:r>
           </w:p>
         </w:tc>
@@ -91,7 +116,7 @@
               <w:rPr>
                 <w:b/>
               </w:rPr>
-              <w:t>Who's There</w:t>
+              <w:t>Examples</w:t>
             </w:r>
           </w:p>
         </w:tc>
@@ -127,7 +152,7 @@
           </w:tcPr>
           <w:p>
             <w:r>
-              <w:t>CLEAResult, ICF, Franklin Energy, Willdan, TRC, Frontier Energy</w:t>
+              <w:t>CLEAResult, ICF, Franklin Energy</w:t>
             </w:r>
           </w:p>
         </w:tc>
@@ -137,7 +162,7 @@
           </w:tcPr>
           <w:p>
             <w:r>
-              <w:t>Rebate/BYOD program administration only — none administer utility-OWNED battery assets</w:t>
+              <w:t>Customer-owned (BYOD) device programs only — none administer utility-owned assets</w:t>
             </w:r>
           </w:p>
         </w:tc>
@@ -149,7 +174,7 @@
           </w:tcPr>
           <w:p>
             <w:r>
-              <w:t>Engineering firms</w:t>
+              <w:t>Engineering / EPC firms</w:t>
             </w:r>
           </w:p>
         </w:tc>
@@ -159,7 +184,7 @@
           </w:tcPr>
           <w:p>
             <w:r>
-              <w:t>Stantec, Black &amp; Veatch, Burns &amp; McDonnell</w:t>
+              <w:t>Stantec, Willdan, Black &amp; Veatch</w:t>
             </w:r>
           </w:p>
         </w:tc>
@@ -169,7 +194,7 @@
           </w:tcPr>
           <w:p>
             <w:r>
-              <w:t>Grid-scale storage EPC — no residential fleet administration</w:t>
+              <w:t>Grid-scale construction; no residential fleet operations</w:t>
             </w:r>
           </w:p>
         </w:tc>
@@ -181,7 +206,7 @@
           </w:tcPr>
           <w:p>
             <w:r>
-              <w:t>VPP software / aggregators</w:t>
+              <w:t>VPP software &amp; aggregators</w:t>
             </w:r>
           </w:p>
         </w:tc>
@@ -191,7 +216,7 @@
           </w:tcPr>
           <w:p>
             <w:r>
-              <w:t>EnergyHub, Uplight/AutoGrid, Tesla, Sunrun</w:t>
+              <w:t>Tesla, EnergyHub, Uplight, Sunrun</w:t>
             </w:r>
           </w:p>
         </w:tc>
@@ -201,7 +226,39 @@
           </w:tcPr>
           <w:p>
             <w:r>
-              <w:t>Software, dispatch, digital enrollment — no field operations (site selection, contractor networks, install QA, hosting agreements)</w:t>
+              <w:t>Software, dispatch, self-serve enrollment; no field operations. Sunrun owns its own fleets (competing procurement model, concentrated in CA)</w:t>
+            </w:r>
+          </w:p>
+        </w:tc>
+      </w:tr>
+      <w:tr>
+        <w:tc>
+          <w:tcPr>
+            <w:tcW w:type="dxa" w:w="2880"/>
+          </w:tcPr>
+          <w:p>
+            <w:r>
+              <w:t>The one that tried</w:t>
+            </w:r>
+          </w:p>
+        </w:tc>
+        <w:tc>
+          <w:tcPr>
+            <w:tcW w:type="dxa" w:w="2880"/>
+          </w:tcPr>
+          <w:p>
+            <w:r>
+              <w:t>Swell Energy</w:t>
+            </w:r>
+          </w:p>
+        </w:tc>
+        <w:tc>
+          <w:tcPr>
+            <w:tcW w:type="dxa" w:w="2880"/>
+          </w:tcPr>
+          <w:p>
+            <w:r>
+              <w:t>Insolvent Sept 2024 — carried hardware financing risk on its own balance sheet. APTIM's fee-for-service model does not.</w:t>
             </w:r>
           </w:p>
         </w:tc>
@@ -211,10 +268,10 @@
     <w:p>
       <w:r>
         <w:rPr>
-          <w:b w:val="0"/>
+          <w:b/>
           <w:i w:val="0"/>
         </w:rPr>
-        <w:t>Proof case: Green Mountain Power runs the largest utility-owned residential fleet in the US (~9,000 Powerwalls) and had to self-assemble the administrator role from three vendors — its own control room, Tesla for dispatch, and Customized Energy Solutions for ISO-NE market integration. The service APTIM would offer had to be improvised in-house by the flagship utility because nobody sells it.</w:t>
+        <w:t>Geography of the competition: Sunrun, Tesla, Willdan, and Base Power (the one quasi-turnkey player, ERCOT-only) all concentrate in California and Texas. The Midwest and Gulf Coast are uncontested — exactly where APTIM's incumbency is strongest.</w:t>
       </w:r>
     </w:p>
     <w:p>
@@ -228,297 +285,170 @@
           <w:color w:val="1B2A5E"/>
           <w:sz w:val="32"/>
         </w:rPr>
-        <w:t>2. Direct Competitor Check</w:t>
+        <w:t>3. The Three Target Markets</w:t>
       </w:r>
     </w:p>
-    <w:tbl>
-      <w:tblPr>
-        <w:tblStyle w:val="LightGrid-Accent1"/>
-        <w:tblW w:type="auto" w:w="0"/>
-        <w:tblLook w:firstColumn="1" w:firstRow="1" w:lastColumn="0" w:lastRow="0" w:noHBand="0" w:noVBand="1" w:val="04A0"/>
-      </w:tblPr>
-      <w:tblGrid>
-        <w:gridCol w:w="2880"/>
-        <w:gridCol w:w="2880"/>
-        <w:gridCol w:w="2880"/>
-      </w:tblGrid>
-      <w:tr>
-        <w:tc>
-          <w:tcPr>
-            <w:tcW w:type="dxa" w:w="2880"/>
-          </w:tcPr>
-          <w:p>
-            <w:r/>
-            <w:r>
-              <w:rPr>
-                <w:b/>
-              </w:rPr>
-              <w:t>Firm</w:t>
-            </w:r>
-          </w:p>
-        </w:tc>
-        <w:tc>
-          <w:tcPr>
-            <w:tcW w:type="dxa" w:w="2880"/>
-          </w:tcPr>
-          <w:p>
-            <w:r/>
-            <w:r>
-              <w:rPr>
-                <w:b/>
-              </w:rPr>
-              <w:t>Battery/VPP Activity (2023–2026)</w:t>
-            </w:r>
-          </w:p>
-        </w:tc>
-        <w:tc>
-          <w:tcPr>
-            <w:tcW w:type="dxa" w:w="2880"/>
-          </w:tcPr>
-          <w:p>
-            <w:r/>
-            <w:r>
-              <w:rPr>
-                <w:b/>
-              </w:rPr>
-              <w:t>Utility-Owned Fleet Administration?</w:t>
-            </w:r>
-          </w:p>
-        </w:tc>
-      </w:tr>
-      <w:tr>
-        <w:tc>
-          <w:tcPr>
-            <w:tcW w:type="dxa" w:w="2880"/>
-          </w:tcPr>
-          <w:p>
-            <w:r>
-              <w:t>CLEAResult</w:t>
-            </w:r>
-          </w:p>
-        </w:tc>
-        <w:tc>
-          <w:tcPr>
-            <w:tcW w:type="dxa" w:w="2880"/>
-          </w:tcPr>
-          <w:p>
-            <w:r>
-              <w:t>ATLAS GridSaver DERMS-lite platform (2023); batteries added 2024; Eco Shift battery DR pilot with Efficiency Nova Scotia</w:t>
-            </w:r>
-          </w:p>
-        </w:tc>
-        <w:tc>
-          <w:tcPr>
-            <w:tcW w:type="dxa" w:w="2880"/>
-          </w:tcPr>
-          <w:p>
-            <w:r>
-              <w:t>No — customer-owned devices only</w:t>
-            </w:r>
-          </w:p>
-        </w:tc>
-      </w:tr>
-      <w:tr>
-        <w:tc>
-          <w:tcPr>
-            <w:tcW w:type="dxa" w:w="2880"/>
-          </w:tcPr>
-          <w:p>
-            <w:r>
-              <w:t>ICF</w:t>
-            </w:r>
-          </w:p>
-        </w:tc>
-        <w:tc>
-          <w:tcPr>
-            <w:tcW w:type="dxa" w:w="2880"/>
-          </w:tcPr>
-          <w:p>
-            <w:r>
-              <w:t>VPP consulting/advisory; major DSM contracts ($65M BGE EmPOWER, $35M Midwest recompetes)</w:t>
-            </w:r>
-          </w:p>
-        </w:tc>
-        <w:tc>
-          <w:tcPr>
-            <w:tcW w:type="dxa" w:w="2880"/>
-          </w:tcPr>
-          <w:p>
-            <w:r>
-              <w:t>No</w:t>
-            </w:r>
-          </w:p>
-        </w:tc>
-      </w:tr>
-      <w:tr>
-        <w:tc>
-          <w:tcPr>
-            <w:tcW w:type="dxa" w:w="2880"/>
-          </w:tcPr>
-          <w:p>
-            <w:r>
-              <w:t>Franklin Energy</w:t>
-            </w:r>
-          </w:p>
-        </w:tc>
-        <w:tc>
-          <w:tcPr>
-            <w:tcW w:type="dxa" w:w="2880"/>
-          </w:tcPr>
-          <w:p>
-            <w:r>
-              <w:t>BYOD battery programs (NC electric co-ops); 2.25M+ devices, 2,000+ MW load reduction</w:t>
-            </w:r>
-          </w:p>
-        </w:tc>
-        <w:tc>
-          <w:tcPr>
-            <w:tcW w:type="dxa" w:w="2880"/>
-          </w:tcPr>
-          <w:p>
-            <w:r>
-              <w:t>No — customer-owned BYOD only</w:t>
-            </w:r>
-          </w:p>
-        </w:tc>
-      </w:tr>
-      <w:tr>
-        <w:tc>
-          <w:tcPr>
-            <w:tcW w:type="dxa" w:w="2880"/>
-          </w:tcPr>
-          <w:p>
-            <w:r>
-              <w:t>Willdan</w:t>
-            </w:r>
-          </w:p>
-        </w:tc>
-        <w:tc>
-          <w:tcPr>
-            <w:tcW w:type="dxa" w:w="2880"/>
-          </w:tcPr>
-          <w:p>
-            <w:r>
-              <w:t>Battery deployment as EPC/ESCO for institutions ($49M Mt. SAC incl. BESS; $330M LADWP program)</w:t>
-            </w:r>
-          </w:p>
-        </w:tc>
-        <w:tc>
-          <w:tcPr>
-            <w:tcW w:type="dxa" w:w="2880"/>
-          </w:tcPr>
-          <w:p>
-            <w:r>
-              <w:t>No — construction contractor role, not fleet administration</w:t>
-            </w:r>
-          </w:p>
-        </w:tc>
-      </w:tr>
-      <w:tr>
-        <w:tc>
-          <w:tcPr>
-            <w:tcW w:type="dxa" w:w="2880"/>
-          </w:tcPr>
-          <w:p>
-            <w:r>
-              <w:t>TRC Companies</w:t>
-            </w:r>
-          </w:p>
-        </w:tc>
-        <w:tc>
-          <w:tcPr>
-            <w:tcW w:type="dxa" w:w="2880"/>
-          </w:tcPr>
-          <w:p>
-            <w:r>
-              <w:t>DERMS consulting practice; BESS engineering; one CA demonstration VPP (Lancaster)</w:t>
-            </w:r>
-          </w:p>
-        </w:tc>
-        <w:tc>
-          <w:tcPr>
-            <w:tcW w:type="dxa" w:w="2880"/>
-          </w:tcPr>
-          <w:p>
-            <w:r>
-              <w:t>No — consulting, not administration</w:t>
-            </w:r>
-          </w:p>
-        </w:tc>
-      </w:tr>
-      <w:tr>
-        <w:tc>
-          <w:tcPr>
-            <w:tcW w:type="dxa" w:w="2880"/>
-          </w:tcPr>
-          <w:p>
-            <w:r>
-              <w:t>Frontier Energy</w:t>
-            </w:r>
-          </w:p>
-        </w:tc>
-        <w:tc>
-          <w:tcPr>
-            <w:tcW w:type="dxa" w:w="2880"/>
-          </w:tcPr>
-          <w:p>
-            <w:r>
-              <w:t>EE administration + DER measurement/data services</w:t>
-            </w:r>
-          </w:p>
-        </w:tc>
-        <w:tc>
-          <w:tcPr>
-            <w:tcW w:type="dxa" w:w="2880"/>
-          </w:tcPr>
-          <w:p>
-            <w:r>
-              <w:t>No battery program activity found</w:t>
-            </w:r>
-          </w:p>
-        </w:tc>
-      </w:tr>
-      <w:tr>
-        <w:tc>
-          <w:tcPr>
-            <w:tcW w:type="dxa" w:w="2880"/>
-          </w:tcPr>
-          <w:p>
-            <w:r>
-              <w:t>Stantec</w:t>
-            </w:r>
-          </w:p>
-        </w:tc>
-        <w:tc>
-          <w:tcPr>
-            <w:tcW w:type="dxa" w:w="2880"/>
-          </w:tcPr>
-          <w:p>
-            <w:r>
-              <w:t>BESS engineering / owner's engineer; strategic advisory</w:t>
-            </w:r>
-          </w:p>
-        </w:tc>
-        <w:tc>
-          <w:tcPr>
-            <w:tcW w:type="dxa" w:w="2880"/>
-          </w:tcPr>
-          <w:p>
-            <w:r>
-              <w:t>No battery program administration at all</w:t>
-            </w:r>
-          </w:p>
-        </w:tc>
-      </w:tr>
-    </w:tbl>
-    <w:p/>
     <w:p>
       <w:r>
         <w:rPr>
+          <w:b w:val="0"/>
+          <w:i/>
+        </w:rPr>
+        <w:t>Narrowed from the full state scan to the three strongest cases — each has an open gap, a concrete demand driver, and an existing APTIM foothold or funding hook.</w:t>
+      </w:r>
+    </w:p>
+    <w:p>
+      <w:pPr>
+        <w:pStyle w:val="Heading2"/>
+      </w:pPr>
+      <w:r>
+        <w:rPr>
+          <w:rFonts w:ascii="Arial" w:hAnsi="Arial"/>
           <w:b/>
-          <w:i w:val="0"/>
+          <w:color w:val="E87B22"/>
+          <w:sz w:val="26"/>
         </w:rPr>
-        <w:t>Bottom line: none of the seven firms most likely to be named by leadership administers utility-owned battery assets.</w:t>
+        <w:t>Target 1 — Wisconsin (The Pilot)</w:t>
+      </w:r>
+    </w:p>
+    <w:p>
+      <w:pPr>
+        <w:pStyle w:val="ListBullet"/>
+      </w:pPr>
+      <w:r>
+        <w:t>APTIM fortress: Program Administrator of Focus on Energy since 2010 — 107 utility territories, 50,000+ projects/year, installed contractor network, 15 years of PSC relationships</w:t>
+      </w:r>
+    </w:p>
+    <w:p>
+      <w:pPr>
+        <w:pStyle w:val="ListBullet"/>
+      </w:pPr>
+      <w:r>
+        <w:t>Zero competition: no utility-owned residential battery fleet exists anywhere in the Midwest; CLEAResult/Franklin operate nearby but only run BYOD/rebate programs</w:t>
+      </w:r>
+    </w:p>
+    <w:p>
+      <w:pPr>
+        <w:pStyle w:val="ListBullet"/>
+      </w:pPr>
+      <w:r>
+        <w:t>Demand driver: winter peak events + aging grid + outage resilience. Batteries earn value in winter peaks and outages — this is NOT a sunny-state-only play; solar pairs where viable, batteries carry the case</w:t>
+      </w:r>
+    </w:p>
+    <w:p>
+      <w:pPr>
+        <w:pStyle w:val="ListBullet"/>
+      </w:pPr>
+      <w:r>
+        <w:t>Funding hook: Focus on Energy demand already exceeds the ~$95M budget; a rate-based fleet gives Wisconsin utilities a new compliance and resilience tool that does not draw on the strained program budget or federal grants</w:t>
+      </w:r>
+    </w:p>
+    <w:p>
+      <w:pPr>
+        <w:pStyle w:val="ListBullet"/>
+      </w:pPr>
+      <w:r>
+        <w:t>Why pilot here: APTIM can move fastest where it already holds the administrator seat, knows the regulator, and has the contractors</w:t>
+      </w:r>
+    </w:p>
+    <w:p>
+      <w:pPr>
+        <w:pStyle w:val="Heading2"/>
+      </w:pPr>
+      <w:r>
+        <w:rPr>
+          <w:rFonts w:ascii="Arial" w:hAnsi="Arial"/>
+          <w:b/>
+          <w:color w:val="E87B22"/>
+          <w:sz w:val="26"/>
+        </w:rPr>
+        <w:t>Target 2 — Louisiana / Gulf Coast (The Expansion Beachhead)</w:t>
+      </w:r>
+    </w:p>
+    <w:p>
+      <w:pPr>
+        <w:pStyle w:val="ListBullet"/>
+      </w:pPr>
+      <w:r>
+        <w:t>APTIM is already in the room: TPA for Entergy New Orleans Energy Smart since 2017 and Entergy Louisiana since 2018</w:t>
+      </w:r>
+    </w:p>
+    <w:p>
+      <w:pPr>
+        <w:pStyle w:val="ListBullet"/>
+      </w:pPr>
+      <w:r>
+        <w:t>The program is already materializing: Entergy New Orleans ~$28M residential battery/DER program approved Dec 2025, implementation plan filed March 2026 — under the Energy Smart umbrella APTIM administers</w:t>
+      </w:r>
+    </w:p>
+    <w:p>
+      <w:pPr>
+        <w:pStyle w:val="ListBullet"/>
+      </w:pPr>
+      <w:r>
+        <w:t>Demand driver: hurricanes. Outage resilience is a life-safety issue on the Gulf Coast — the strongest customer-acceptance story in the country for hosted batteries</w:t>
+      </w:r>
+    </w:p>
+    <w:p>
+      <w:pPr>
+        <w:pStyle w:val="ListBullet"/>
+      </w:pPr>
+      <w:r>
+        <w:t>Zero competition: no fleet administrator operates in the Gulf; Base Power is boxed into ERCOT/Texas</w:t>
+      </w:r>
+    </w:p>
+    <w:p>
+      <w:pPr>
+        <w:pStyle w:val="ListBullet"/>
+      </w:pPr>
+      <w:r>
+        <w:t>Political durability: resilience spending survives funding swings — Louisiana ended its 2026 efficiency program, but storm-hardening investment continues</w:t>
+      </w:r>
+    </w:p>
+    <w:p>
+      <w:pPr>
+        <w:pStyle w:val="Heading2"/>
+      </w:pPr>
+      <w:r>
+        <w:rPr>
+          <w:rFonts w:ascii="Arial" w:hAnsi="Arial"/>
+          <w:b/>
+          <w:color w:val="E87B22"/>
+          <w:sz w:val="26"/>
+        </w:rPr>
+        <w:t>Target 3 — Washington State (The Mandate Play)</w:t>
+      </w:r>
+    </w:p>
+    <w:p>
+      <w:pPr>
+        <w:pStyle w:val="ListBullet"/>
+      </w:pPr>
+      <w:r>
+        <w:t>Demand driver: Clean Buildings Performance Standard penalties begin June 2026 ($1.00/sq ft/yr), and CETA requires 100% clean electricity by 2045 — utilities and building owners MUST act</w:t>
+      </w:r>
+    </w:p>
+    <w:p>
+      <w:pPr>
+        <w:pStyle w:val="ListBullet"/>
+      </w:pPr>
+      <w:r>
+        <w:t>Funding hook: $150M+ in state early-adopter incentives sit largely UNTAPPED — a program-administration opportunity in itself (someone must help owners find and use it)</w:t>
+      </w:r>
+    </w:p>
+    <w:p>
+      <w:pPr>
+        <w:pStyle w:val="ListBullet"/>
+      </w:pPr>
+      <w:r>
+        <w:t>Competition is thin: Willdan just won Puget Sound Energy program implementation (honest caveat — the one contested territory), but nobody offers fleet administration; Sunrun/Tesla presence is minimal compared to CA</w:t>
+      </w:r>
+    </w:p>
+    <w:p>
+      <w:pPr>
+        <w:pStyle w:val="ListBullet"/>
+      </w:pPr>
+      <w:r>
+        <w:t>Why third: no APTIM incumbency here — this is the growth-story market that proves the model travels beyond existing relationships. Solar pairs better here than reputation suggests (mild climate, high summer output)</w:t>
       </w:r>
     </w:p>
     <w:p>
@@ -532,7 +462,7 @@
           <w:color w:val="1B2A5E"/>
           <w:sz w:val="32"/>
         </w:rPr>
-        <w:t>3. VPP Aggregators and Platforms: Partners, Not Competitors</w:t>
+        <w:t>4. Prioritization (Cost / Ease / Timeframe / Impact — Samantha's Framework)</w:t>
       </w:r>
     </w:p>
     <w:tbl>
@@ -542,14 +472,16 @@
         <w:tblLook w:firstColumn="1" w:firstRow="1" w:lastColumn="0" w:lastRow="0" w:noHBand="0" w:noVBand="1" w:val="04A0"/>
       </w:tblPr>
       <w:tblGrid>
-        <w:gridCol w:w="2880"/>
-        <w:gridCol w:w="2880"/>
-        <w:gridCol w:w="2880"/>
+        <w:gridCol w:w="1728"/>
+        <w:gridCol w:w="1728"/>
+        <w:gridCol w:w="1728"/>
+        <w:gridCol w:w="1728"/>
+        <w:gridCol w:w="1728"/>
       </w:tblGrid>
       <w:tr>
         <w:tc>
           <w:tcPr>
-            <w:tcW w:type="dxa" w:w="2880"/>
+            <w:tcW w:type="dxa" w:w="1728"/>
           </w:tcPr>
           <w:p>
             <w:r/>
@@ -557,13 +489,13 @@
               <w:rPr>
                 <w:b/>
               </w:rPr>
-              <w:t>Company</w:t>
+              <w:t>Market</w:t>
             </w:r>
           </w:p>
         </w:tc>
         <w:tc>
           <w:tcPr>
-            <w:tcW w:type="dxa" w:w="2880"/>
+            <w:tcW w:type="dxa" w:w="1728"/>
           </w:tcPr>
           <w:p>
             <w:r/>
@@ -571,13 +503,13 @@
               <w:rPr>
                 <w:b/>
               </w:rPr>
-              <w:t>Model</w:t>
+              <w:t>Ease of Entry</w:t>
             </w:r>
           </w:p>
         </w:tc>
         <w:tc>
           <w:tcPr>
-            <w:tcW w:type="dxa" w:w="2880"/>
+            <w:tcW w:type="dxa" w:w="1728"/>
           </w:tcPr>
           <w:p>
             <w:r/>
@@ -585,7 +517,35 @@
               <w:rPr>
                 <w:b/>
               </w:rPr>
-              <w:t>Verdict for Our Pitch</w:t>
+              <w:t>Timeframe</w:t>
+            </w:r>
+          </w:p>
+        </w:tc>
+        <w:tc>
+          <w:tcPr>
+            <w:tcW w:type="dxa" w:w="1728"/>
+          </w:tcPr>
+          <w:p>
+            <w:r/>
+            <w:r>
+              <w:rPr>
+                <w:b/>
+              </w:rPr>
+              <w:t>Impact</w:t>
+            </w:r>
+          </w:p>
+        </w:tc>
+        <w:tc>
+          <w:tcPr>
+            <w:tcW w:type="dxa" w:w="1728"/>
+          </w:tcPr>
+          <w:p>
+            <w:r/>
+            <w:r>
+              <w:rPr>
+                <w:b/>
+              </w:rPr>
+              <w:t>Role in Story</w:t>
             </w:r>
           </w:p>
         </w:tc>
@@ -593,31 +553,51 @@
       <w:tr>
         <w:tc>
           <w:tcPr>
-            <w:tcW w:type="dxa" w:w="2880"/>
+            <w:tcW w:type="dxa" w:w="1728"/>
           </w:tcPr>
           <w:p>
             <w:r>
-              <w:t>Tesla</w:t>
+              <w:t>Wisconsin</w:t>
             </w:r>
           </w:p>
         </w:tc>
         <w:tc>
           <w:tcPr>
-            <w:tcW w:type="dxa" w:w="2880"/>
+            <w:tcW w:type="dxa" w:w="1728"/>
           </w:tcPr>
           <w:p>
             <w:r>
-              <w:t>OEM aggregator of customer-owned Powerwalls; 100,000+ Powerwalls in VPPs globally</w:t>
+              <w:t>Highest — incumbent administrator, existing contractors and regulator relationships</w:t>
             </w:r>
           </w:p>
         </w:tc>
         <w:tc>
           <w:tcPr>
-            <w:tcW w:type="dxa" w:w="2880"/>
+            <w:tcW w:type="dxa" w:w="1728"/>
           </w:tcPr>
           <w:p>
             <w:r>
-              <w:t>Essential hardware/API counterparty — a utility-owned Powerwall fleet works through Tesla's platform (as GMP does)</w:t>
+              <w:t>Year 1 pilot</w:t>
+            </w:r>
+          </w:p>
+        </w:tc>
+        <w:tc>
+          <w:tcPr>
+            <w:tcW w:type="dxa" w:w="1728"/>
+          </w:tcPr>
+          <w:p>
+            <w:r>
+              <w:t>Proves the model + numbers</w:t>
+            </w:r>
+          </w:p>
+        </w:tc>
+        <w:tc>
+          <w:tcPr>
+            <w:tcW w:type="dxa" w:w="1728"/>
+          </w:tcPr>
+          <w:p>
+            <w:r>
+              <w:t>PILOT</w:t>
             </w:r>
           </w:p>
         </w:tc>
@@ -625,31 +605,51 @@
       <w:tr>
         <w:tc>
           <w:tcPr>
-            <w:tcW w:type="dxa" w:w="2880"/>
+            <w:tcW w:type="dxa" w:w="1728"/>
           </w:tcPr>
           <w:p>
             <w:r>
-              <w:t>EnergyHub</w:t>
+              <w:t>Louisiana / Gulf</w:t>
             </w:r>
           </w:p>
         </w:tc>
         <w:tc>
           <w:tcPr>
-            <w:tcW w:type="dxa" w:w="2880"/>
+            <w:tcW w:type="dxa" w:w="1728"/>
           </w:tcPr>
           <w:p>
             <w:r>
-              <w:t>DERMS software, 160+ utilities; runs digital layer for APS, SRP, National Grid battery programs</w:t>
+              <w:t>High — existing Entergy TPA seats; battery program already funded</w:t>
             </w:r>
           </w:p>
         </w:tc>
         <w:tc>
           <w:tcPr>
-            <w:tcW w:type="dxa" w:w="2880"/>
+            <w:tcW w:type="dxa" w:w="1728"/>
           </w:tcPr>
           <w:p>
             <w:r>
-              <w:t>Natural partner — the software layer under an APTIM-run program; already named in Entergy New Orleans battery pilot</w:t>
+              <w:t>Years 1–2</w:t>
+            </w:r>
+          </w:p>
+        </w:tc>
+        <w:tc>
+          <w:tcPr>
+            <w:tcW w:type="dxa" w:w="1728"/>
+          </w:tcPr>
+          <w:p>
+            <w:r>
+              <w:t>Resilience showcase; deepest customer need</w:t>
+            </w:r>
+          </w:p>
+        </w:tc>
+        <w:tc>
+          <w:tcPr>
+            <w:tcW w:type="dxa" w:w="1728"/>
+          </w:tcPr>
+          <w:p>
+            <w:r>
+              <w:t>FIRST EXPANSION</w:t>
             </w:r>
           </w:p>
         </w:tc>
@@ -657,95 +657,51 @@
       <w:tr>
         <w:tc>
           <w:tcPr>
-            <w:tcW w:type="dxa" w:w="2880"/>
+            <w:tcW w:type="dxa" w:w="1728"/>
           </w:tcPr>
           <w:p>
             <w:r>
-              <w:t>Uplight + AutoGrid</w:t>
+              <w:t>Washington</w:t>
             </w:r>
           </w:p>
         </w:tc>
         <w:tc>
           <w:tcPr>
-            <w:tcW w:type="dxa" w:w="2880"/>
+            <w:tcW w:type="dxa" w:w="1728"/>
           </w:tcPr>
           <w:p>
             <w:r>
-              <w:t>DERMS + customer engagement software (merged Feb 2024, ~8.3 GW under management)</w:t>
+              <w:t>Medium — no incumbency, one active competitor (Willdan/PSE)</w:t>
             </w:r>
           </w:p>
         </w:tc>
         <w:tc>
           <w:tcPr>
-            <w:tcW w:type="dxa" w:w="2880"/>
+            <w:tcW w:type="dxa" w:w="1728"/>
           </w:tcPr>
           <w:p>
             <w:r>
-              <w:t>Partner or soft competitor on digital-only programs; no field operations</w:t>
-            </w:r>
-          </w:p>
-        </w:tc>
-      </w:tr>
-      <w:tr>
-        <w:tc>
-          <w:tcPr>
-            <w:tcW w:type="dxa" w:w="2880"/>
-          </w:tcPr>
-          <w:p>
-            <w:r>
-              <w:t>Sunrun</w:t>
+              <w:t>Years 2–3</w:t>
             </w:r>
           </w:p>
         </w:tc>
         <w:tc>
           <w:tcPr>
-            <w:tcW w:type="dxa" w:w="2880"/>
+            <w:tcW w:type="dxa" w:w="1728"/>
           </w:tcPr>
           <w:p>
             <w:r>
-              <w:t>16 VPPs, 20k+ customers; sells utilities capacity from fleets SUNRUN owns (CalReady: 16,000 customers, ~50 MW)</w:t>
+              <w:t>Proves the model scales into mandate-driven markets</w:t>
             </w:r>
           </w:p>
         </w:tc>
         <w:tc>
           <w:tcPr>
-            <w:tcW w:type="dxa" w:w="2880"/>
+            <w:tcW w:type="dxa" w:w="1728"/>
           </w:tcPr>
           <w:p>
             <w:r>
-              <w:t>The real competitive threat — at the model level: third-party-owned capacity contracts as an alternative to utility ownership</w:t>
-            </w:r>
-          </w:p>
-        </w:tc>
-      </w:tr>
-      <w:tr>
-        <w:tc>
-          <w:tcPr>
-            <w:tcW w:type="dxa" w:w="2880"/>
-          </w:tcPr>
-          <w:p>
-            <w:r>
-              <w:t>Voltus / CPower</w:t>
-            </w:r>
-          </w:p>
-        </w:tc>
-        <w:tc>
-          <w:tcPr>
-            <w:tcW w:type="dxa" w:w="2880"/>
-          </w:tcPr>
-          <w:p>
-            <w:r>
-              <w:t>Wholesale C&amp;I demand response aggregators</w:t>
-            </w:r>
-          </w:p>
-        </w:tc>
-        <w:tc>
-          <w:tcPr>
-            <w:tcW w:type="dxa" w:w="2880"/>
-          </w:tcPr>
-          <w:p>
-            <w:r>
-              <w:t>Non-competitors; potential wholesale monetization partners</w:t>
+              <w:t>GROWTH PROOF</w:t>
             </w:r>
           </w:p>
         </w:tc>
@@ -753,49 +709,12 @@
     </w:tbl>
     <w:p/>
     <w:p>
-      <w:pPr>
-        <w:pStyle w:val="Heading2"/>
-      </w:pPr>
       <w:r>
         <w:rPr>
-          <w:rFonts w:ascii="Arial" w:hAnsi="Arial"/>
-          <w:b/>
-          <w:color w:val="E87B22"/>
-          <w:sz w:val="26"/>
+          <w:b w:val="0"/>
+          <w:i w:val="0"/>
         </w:rPr>
-        <w:t>The Swell Energy Cautionary Tale (Present This Honestly)</w:t>
-      </w:r>
-    </w:p>
-    <w:p>
-      <w:pPr>
-        <w:pStyle w:val="ListBullet"/>
-      </w:pPr>
-      <w:r>
-        <w:t>Swell Energy was the closest thing to a true turnkey residential battery program administrator (Hawaiian Electric Home Battery Rewards, SMUD VPP).</w:t>
-      </w:r>
-    </w:p>
-    <w:p>
-      <w:pPr>
-        <w:pStyle w:val="ListBullet"/>
-      </w:pPr>
-      <w:r>
-        <w:t>It went insolvent in September 2024 — Hawaiian Electric had to cover customer incentives Swell owed; another utility paused its VPP program on the news.</w:t>
-      </w:r>
-    </w:p>
-    <w:p>
-      <w:pPr>
-        <w:pStyle w:val="ListBullet"/>
-      </w:pPr>
-      <w:r>
-        <w:t>Why it cuts in APTIM's favor: Swell failed as a venture-funded startup carrying financing risk on its own balance sheet. APTIM's model is fee-for-service administration of utility-owned assets — no hardware on APTIM's books.</w:t>
-      </w:r>
-    </w:p>
-    <w:p>
-      <w:pPr>
-        <w:pStyle w:val="ListBullet"/>
-      </w:pPr>
-      <w:r>
-        <w:t>Utilities burned by aggregator insolvency now have a concrete reason to prefer owning the asset and hiring a stable, diversified administrator.</w:t>
+        <w:t>Markets deliberately excluded: California and Texas (saturated — Sunrun, Tesla, Base Power, Willdan all concentrated there); New England (Green Mountain Power self-administers; market claimed); New York City (Local Law 97 is a commercial-buildings play, off-scope for a residential fleet pitch — keep as a future commercial variant).</w:t>
       </w:r>
     </w:p>
     <w:p>
@@ -809,270 +728,7 @@
           <w:color w:val="1B2A5E"/>
           <w:sz w:val="32"/>
         </w:rPr>
-        <w:t>4. Utility-Owned Programs Operating Today (Precedent, Not Competition)</w:t>
-      </w:r>
-    </w:p>
-    <w:tbl>
-      <w:tblPr>
-        <w:tblStyle w:val="LightGrid-Accent1"/>
-        <w:tblW w:type="auto" w:w="0"/>
-        <w:tblLook w:firstColumn="1" w:firstRow="1" w:lastColumn="0" w:lastRow="0" w:noHBand="0" w:noVBand="1" w:val="04A0"/>
-      </w:tblPr>
-      <w:tblGrid>
-        <w:gridCol w:w="2880"/>
-        <w:gridCol w:w="2880"/>
-        <w:gridCol w:w="2880"/>
-      </w:tblGrid>
-      <w:tr>
-        <w:tc>
-          <w:tcPr>
-            <w:tcW w:type="dxa" w:w="2880"/>
-          </w:tcPr>
-          <w:p>
-            <w:r/>
-            <w:r>
-              <w:rPr>
-                <w:b/>
-              </w:rPr>
-              <w:t>Program</w:t>
-            </w:r>
-          </w:p>
-        </w:tc>
-        <w:tc>
-          <w:tcPr>
-            <w:tcW w:type="dxa" w:w="2880"/>
-          </w:tcPr>
-          <w:p>
-            <w:r/>
-            <w:r>
-              <w:rPr>
-                <w:b/>
-              </w:rPr>
-              <w:t>Model</w:t>
-            </w:r>
-          </w:p>
-        </w:tc>
-        <w:tc>
-          <w:tcPr>
-            <w:tcW w:type="dxa" w:w="2880"/>
-          </w:tcPr>
-          <w:p>
-            <w:r/>
-            <w:r>
-              <w:rPr>
-                <w:b/>
-              </w:rPr>
-              <w:t>Who Administers It</w:t>
-            </w:r>
-          </w:p>
-        </w:tc>
-      </w:tr>
-      <w:tr>
-        <w:tc>
-          <w:tcPr>
-            <w:tcW w:type="dxa" w:w="2880"/>
-          </w:tcPr>
-          <w:p>
-            <w:r>
-              <w:t>Green Mountain Power (VT) — ~9,000 utility-owned Powerwalls; Zero Outages Initiative (filed Oct 2023, ~$280M Phase 1) proposes utility-owned batteries prioritizing outage-prone areas</w:t>
-            </w:r>
-          </w:p>
-        </w:tc>
-        <w:tc>
-          <w:tcPr>
-            <w:tcW w:type="dxa" w:w="2880"/>
-          </w:tcPr>
-          <w:p>
-            <w:r>
-              <w:t>Utility-owned, rate-based, PUC-approved tariffs (2020; caps lifted Aug 2023)</w:t>
-            </w:r>
-          </w:p>
-        </w:tc>
-        <w:tc>
-          <w:tcPr>
-            <w:tcW w:type="dxa" w:w="2880"/>
-          </w:tcPr>
-          <w:p>
-            <w:r>
-              <w:t>Self-assembled from 3 vendors — no TPA existed to hire</w:t>
-            </w:r>
-          </w:p>
-        </w:tc>
-      </w:tr>
-      <w:tr>
-        <w:tc>
-          <w:tcPr>
-            <w:tcW w:type="dxa" w:w="2880"/>
-          </w:tcPr>
-          <w:p>
-            <w:r>
-              <w:t>Liberty Utilities (NH) — 200 utility-owned Powerwalls, approved Jan 2019 (Docket DE 17-189)</w:t>
-            </w:r>
-          </w:p>
-        </w:tc>
-        <w:tc>
-          <w:tcPr>
-            <w:tcW w:type="dxa" w:w="2880"/>
-          </w:tcPr>
-          <w:p>
-            <w:r>
-              <w:t>Utility-owned pilot, first TOU + battery rate design in the nation</w:t>
-            </w:r>
-          </w:p>
-        </w:tc>
-        <w:tc>
-          <w:tcPr>
-            <w:tcW w:type="dxa" w:w="2880"/>
-          </w:tcPr>
-          <w:p>
-            <w:r>
-              <w:t>In-house</w:t>
-            </w:r>
-          </w:p>
-        </w:tc>
-      </w:tr>
-      <w:tr>
-        <w:tc>
-          <w:tcPr>
-            <w:tcW w:type="dxa" w:w="2880"/>
-          </w:tcPr>
-          <w:p>
-            <w:r>
-              <w:t>APS (AZ) — 2018 utility-installed demonstration (~40 homes); current Storage Rewards is customer-owned BYOD (ACC approved Mar 2025)</w:t>
-            </w:r>
-          </w:p>
-        </w:tc>
-        <w:tc>
-          <w:tcPr>
-            <w:tcW w:type="dxa" w:w="2880"/>
-          </w:tcPr>
-          <w:p>
-            <w:r>
-              <w:t>Mixed</w:t>
-            </w:r>
-          </w:p>
-        </w:tc>
-        <w:tc>
-          <w:tcPr>
-            <w:tcW w:type="dxa" w:w="2880"/>
-          </w:tcPr>
-          <w:p>
-            <w:r>
-              <w:t>EnergyHub (digital layer only)</w:t>
-            </w:r>
-          </w:p>
-        </w:tc>
-      </w:tr>
-      <w:tr>
-        <w:tc>
-          <w:tcPr>
-            <w:tcW w:type="dxa" w:w="2880"/>
-          </w:tcPr>
-          <w:p>
-            <w:r>
-              <w:t>Entergy New Orleans — ~$28M residential battery/DER program approved Dec 2025; implementation plan filed Mar 2026</w:t>
-            </w:r>
-          </w:p>
-        </w:tc>
-        <w:tc>
-          <w:tcPr>
-            <w:tcW w:type="dxa" w:w="2880"/>
-          </w:tcPr>
-          <w:p>
-            <w:r>
-              <w:t>Under the Energy Smart umbrella APTIM has administered since 2017</w:t>
-            </w:r>
-          </w:p>
-        </w:tc>
-        <w:tc>
-          <w:tcPr>
-            <w:tcW w:type="dxa" w:w="2880"/>
-          </w:tcPr>
-          <w:p>
-            <w:r>
-              <w:t>EnergyHub named for dispatch; program-level administration = APTIM's existing seat</w:t>
-            </w:r>
-          </w:p>
-        </w:tc>
-      </w:tr>
-    </w:tbl>
-    <w:p/>
-    <w:p>
-      <w:r>
-        <w:rPr>
-          <w:b/>
-          <w:i w:val="0"/>
-        </w:rPr>
-        <w:t>The Entergy New Orleans row is the key slide point: APTIM is already positioned inside a major utility residential battery program in its own client portfolio. This pitch formalizes and scales something already landing on APTIM's desk.</w:t>
-      </w:r>
-    </w:p>
-    <w:p>
-      <w:r>
-        <w:rPr>
-          <w:b w:val="0"/>
-          <w:i w:val="0"/>
-        </w:rPr>
-        <w:t>Regulatory precedent is established: Vermont approved fully tariffed utility-owned home storage in 2020 and lifted program caps in 2023; New Hampshire approved utility-owned residential storage in 2019. The rate-basing question has been answered "yes" in two states.</w:t>
-      </w:r>
-    </w:p>
-    <w:p>
-      <w:pPr>
-        <w:pStyle w:val="Heading1"/>
-      </w:pPr>
-      <w:r>
-        <w:rPr>
-          <w:rFonts w:ascii="Arial" w:hAnsi="Arial"/>
-          <w:b/>
-          <w:color w:val="1B2A5E"/>
-          <w:sz w:val="32"/>
-        </w:rPr>
-        <w:t>5. The Competitive Narrative for Leadership (Four Beats)</w:t>
-      </w:r>
-    </w:p>
-    <w:p>
-      <w:pPr>
-        <w:pStyle w:val="ListBullet"/>
-      </w:pPr>
-      <w:r>
-        <w:t>1. The market is validated — GMP, Liberty, and now Entergy New Orleans prove utilities will own residential batteries; DSM administration is a proven, growing services market.</w:t>
-      </w:r>
-    </w:p>
-    <w:p>
-      <w:pPr>
-        <w:pStyle w:val="ListBullet"/>
-      </w:pPr>
-      <w:r>
-        <w:t>2. The seat is empty — every existing player stops short of full fleet administration: software firms won't do field ops, program administrators only handle customer-owned devices, engineering firms only build grid-scale.</w:t>
-      </w:r>
-    </w:p>
-    <w:p>
-      <w:pPr>
-        <w:pStyle w:val="ListBullet"/>
-      </w:pPr>
-      <w:r>
-        <w:t>3. The one company that tried the adjacent role failed for reasons that do not apply to APTIM — Swell carried venture financing risk; APTIM's model is fee-for-service with no hardware on its balance sheet.</w:t>
-      </w:r>
-    </w:p>
-    <w:p>
-      <w:pPr>
-        <w:pStyle w:val="ListBullet"/>
-      </w:pPr>
-      <w:r>
-        <w:t>4. APTIM is already in the room — the Energy Smart New Orleans battery program sits under a TPA umbrella APTIM has held since 2017.</w:t>
-      </w:r>
-    </w:p>
-    <w:p>
-      <w:pPr>
-        <w:pStyle w:val="Heading1"/>
-      </w:pPr>
-      <w:r>
-        <w:rPr>
-          <w:rFonts w:ascii="Arial" w:hAnsi="Arial"/>
-          <w:b/>
-          <w:color w:val="1B2A5E"/>
-          <w:sz w:val="32"/>
-        </w:rPr>
-        <w:t>6. Draft Slide Content (APTIM Template, Arial, 18pt body)</w:t>
+        <w:t>5. Draft Slide Content (APTIM Template, Arial, 18pt body)</w:t>
       </w:r>
     </w:p>
     <w:p>
@@ -1086,16 +742,7 @@
           <w:color w:val="E87B22"/>
           <w:sz w:val="26"/>
         </w:rPr>
-        <w:t>Slide 1 — Competitive Landscape: An Empty Seat</w:t>
-      </w:r>
-    </w:p>
-    <w:p>
-      <w:r>
-        <w:rPr>
-          <w:b w:val="0"/>
-          <w:i/>
-        </w:rPr>
-        <w:t>Layout: title + three-column comparison or table. Content below is final draft text.</w:t>
+        <w:t>Slide 1 — Competitive Landscape: The Seat Is Empty</w:t>
       </w:r>
     </w:p>
     <w:p>
@@ -1111,7 +758,7 @@
         <w:pStyle w:val="ListBullet"/>
       </w:pPr>
       <w:r>
-        <w:t>Engineering firms (Stantec, B&amp;V): grid-scale storage construction, no residential fleets</w:t>
+        <w:t>VPP software (Tesla, EnergyHub): dispatch and enrollment — no field operations</w:t>
       </w:r>
     </w:p>
     <w:p>
@@ -1119,7 +766,7 @@
         <w:pStyle w:val="ListBullet"/>
       </w:pPr>
       <w:r>
-        <w:t>VPP software (EnergyHub, Tesla, Uplight): dispatch and enrollment, no field operations</w:t>
+        <w:t>Aggregators that own fleets (Sunrun, Base Power): concentrated in California and Texas</w:t>
       </w:r>
     </w:p>
     <w:p>
@@ -1127,15 +774,7 @@
         <w:pStyle w:val="ListBullet"/>
       </w:pPr>
       <w:r>
-        <w:t>No company offers turnkey administration of utility-owned residential battery fleets</w:t>
-      </w:r>
-    </w:p>
-    <w:p>
-      <w:pPr>
-        <w:pStyle w:val="ListBullet"/>
-      </w:pPr>
-      <w:r>
-        <w:t>Proof: Green Mountain Power (largest US fleet, ~9,000 batteries) had to self-assemble the role from three vendors</w:t>
+        <w:t>No company administers utility-owned residential battery fleets — the largest one in the US (Green Mountain Power, ~9,000 batteries) had to build the role in-house</w:t>
       </w:r>
     </w:p>
     <w:p>
@@ -1149,7 +788,7 @@
           <w:color w:val="E87B22"/>
           <w:sz w:val="26"/>
         </w:rPr>
-        <w:t>Slide 2 — Why APTIM Wins This Seat</w:t>
+        <w:t>Slide 2 — Where APTIM Wins: Three Markets</w:t>
       </w:r>
     </w:p>
     <w:p>
@@ -1157,7 +796,7 @@
         <w:pStyle w:val="ListBullet"/>
       </w:pPr>
       <w:r>
-        <w:t>Only firm combining program administration + contractor networks + government/regulatory expertise at scale</w:t>
+        <w:t>Wisconsin (pilot): 15-year incumbency, 107 utility territories, zero fleet competition in the Midwest</w:t>
       </w:r>
     </w:p>
     <w:p>
@@ -1165,7 +804,7 @@
         <w:pStyle w:val="ListBullet"/>
       </w:pPr>
       <w:r>
-        <w:t>Already inside the precedent: Energy Smart New Orleans (~$28M battery/DER program) sits under APTIM's existing TPA umbrella</w:t>
+        <w:t>Louisiana (expansion): APTIM's Entergy seats + a funded $28M battery program already under APTIM's umbrella + hurricane resilience demand</w:t>
       </w:r>
     </w:p>
     <w:p>
@@ -1173,7 +812,7 @@
         <w:pStyle w:val="ListBullet"/>
       </w:pPr>
       <w:r>
-        <w:t>Fee-for-service model carries no hardware risk — the failure mode that killed Swell Energy does not apply</w:t>
+        <w:t>Washington (growth): mandate penalties from June 2026 + $150M in untapped state incentives + thin competition</w:t>
       </w:r>
     </w:p>
     <w:p>
@@ -1181,7 +820,7 @@
         <w:pStyle w:val="ListBullet"/>
       </w:pPr>
       <w:r>
-        <w:t>Natural partnerships, not build-outs: EnergyHub/Tesla provide the software layer; APTIM provides everything they don't</w:t>
+        <w:t>Excluded on purpose: California and Texas — saturated; New England — claimed by GMP</w:t>
       </w:r>
     </w:p>
     <w:p/>
@@ -1191,7 +830,7 @@
           <w:i/>
           <w:sz w:val="18"/>
         </w:rPr>
-        <w:t>Sources on file: CLEAResult GridSaver press materials; ICF contract announcements; Franklin Energy load management; Willdan/LADWP and Mt. SAC awards; TRC DERMS practice; Tesla utility-deployed Powerwall; EnergyHub program pages (APS, SRP, National Grid, Austin Energy); Uplight-AutoGrid acquisition; Sunrun VPP results and CalReady; Hawaiian Electric statement on Swell insolvency; GMP tariffs and Zero Outages filing (VT PUC 23-3501-PET); Liberty Utilities NH Docket DE 17-189; Entergy New Orleans Energy Smart battery filings and The Lens NOLA coverage; Base Power utility offerings (ERCOT). Full research threads available from Christian.</w:t>
+        <w:t>Sources on file: GMP tariffs and Zero Outages filing (VT PUC 23-3501-PET); Liberty Utilities NH Docket DE 17-189; Entergy New Orleans Energy Smart battery filings; The Lens NOLA; WA Commerce CBPS pages; Hawaiian Electric statement on Swell insolvency; Sunrun/Tesla/Base Power program pages; CLEAResult, ICF, Franklin Energy, Willdan program materials; ACEEE 2025 Scorecard; PSC Wisconsin. Full research threads available from Christian.</w:t>
       </w:r>
     </w:p>
     <w:sectPr>

</xml_diff>